<commit_message>
Agregar análisis dinámico de F001/F002 y actualizar guion
</commit_message>
<xml_diff>
--- a/docs/informe-grupo05/entrega/Grupo_05_Informe_Tecnico.docx
+++ b/docs/informe-grupo05/entrega/Grupo_05_Informe_Tecnico.docx
@@ -38,7 +38,7 @@
     </w:p>
     <w:p>
       <w:r>
-        <w:t>Grupo 05 · Ciclo 2026 · 23 de octubre de 2026</w:t>
+        <w:t>Grupo 05 · Ciclo 2026 · 23 de octubre de 2026 · Análisis dinámico: 29 de octubre de 2026</w:t>
       </w:r>
     </w:p>
     <w:p>
@@ -89,7 +89,7 @@
     </w:p>
     <w:p>
       <w:r>
-        <w:t>Analizamos siete recursos: dos archivos Windows, dos correos y tres URLs. Clasificamos cuatro como maliciosos y tres como sospechosos; ninguno se acreditó como limpio. La evidencia más sólida combina huellas coincidentes y reputación: 47 motores para cada binario Windows y 50 para el ELF asociado a U002. R004 incorpora una URL remota exacta con 12 detecciones. Los restantes casos presentan señales mixtas. Estos resultados no demuestran infección de un equipo.</w:t>
+        <w:t>Analizamos siete recursos: dos archivos Windows, dos correos y tres URLs. Clasificamos cuatro como maliciosos y tres como sospechosos; ninguno se acreditó como limpio. F001 y F002 conservan el veredicto MALICIOSO: a las huellas coincidentes y 47 detecciones de VirusTotal por binario se agregan dos reportes de ejecución de ANY.RUN, que clasifican ambas muestras como «Malicious activity». El ELF asociado a U002 tiene 50 detecciones. R004 incorpora una URL remota exacta con 12 detecciones. Los restantes casos presentan señales mixtas. La ejecución en el sandbox de ANY.RUN no demuestra infección de un equipo fuera de ese entorno.</w:t>
       </w:r>
     </w:p>
     <w:tbl>
@@ -563,12 +563,12 @@
     </w:p>
     <w:p>
       <w:r>
-        <w:t>Priorizamos análisis estático y reputación. El ZIP se preservó con su SHA-256; los archivos y correos se extrajeron como datos en una VM mínima derivada de Kali, sin red, sin integración con el host y con montajes noexec. La recuperación usa una base limpia y disco diferencial; no acredita un snapshot formal del hipervisor. No ejecutamos muestras, cargamos HTML ni visitamos destinos sospechosos. Para archivos conocidos consultamos hashes en VirusTotal; para URLs revisamos informes históricos de urlscan. Completamos cabeceras, MXToolbox, RDAP, DNS y crt.sh. Los registros conservan consultas y estados de cada adquisición.</w:t>
+        <w:t>La fase inicial priorizó análisis estático y reputación. El ZIP se preservó con su SHA-256; los archivos y correos se extrajeron como datos en una VM mínima derivada de Kali, sin red, sin integración con el host y con montajes noexec. La recuperación usa una base limpia y disco diferencial; no acredita un snapshot formal del hipervisor. En esa fase no se ejecutaron muestras, cargaron HTML ni visitaron destinos sospechosos. Para archivos conocidos consultamos hashes en VirusTotal; para URLs revisamos informes históricos de urlscan. Completamos cabeceras, MXToolbox, RDAP, DNS y crt.sh. Los registros conservan consultas y estados de cada adquisición.</w:t>
       </w:r>
     </w:p>
     <w:p>
       <w:r>
-        <w:t>Las cabeceras de correo declaran resultados de autenticación; no revalidamos DKIM criptográficamente ni reconstruimos SPF histórico. Las consultas y capturas se adquirieron el 23/10/2026; los históricos web principales corresponden al 16/10. Las familias de malware son atribuciones de terceros. Una URL sin informe, un dominio aparcado o una IP no listada no acreditan legitimidad.</w:t>
+        <w:t>El 29/10/2026 se añadieron reportes PDF de ejecuciones de F001 y F002 en ANY.RUN, en Windows 10 Professional de 64 bits con red. La identidad de cada objeto se vincula por su SHA-256 con el archivo inventariado y consultado en VirusTotal. Los PDF conservan el veredicto del proveedor, un resumen automático, indicadores y detecciones de comportamiento; no incluyen un volcado de eventos o tráfico suficiente para validar de forma independiente todas las relaciones entre procesos, persistencia y comunicaciones que afirma el resumen automático. Las recomendaciones del reporte son contenido generado por el proveedor, no acciones realizadas por el grupo. Las cabeceras de correo declaran resultados de autenticación; no revalidamos DKIM criptográficamente ni reconstruimos SPF histórico. Las consultas y capturas iniciales se adquirieron el 23/10/2026; los históricos web principales corresponden al 16/10 y los reportes ANY.RUN al 29/10. Las etiquetas de familia (ValleyRAT, SilverFox, Winos) son atribuciones automáticas del proveedor, no una identificación independiente. Las IP listadas por ANY.RUN no se tratan como C2 confirmados ni como indicadores para bloqueo sin revisar el tráfico y su relación con el proceso. Una URL sin informe, un dominio aparcado o una IP no listada no acreditan legitimidad.</w:t>
       </w:r>
     </w:p>
     <w:p>
@@ -819,7 +819,7 @@
                 <w:b w:val="0"/>
                 <w:sz w:val="20"/>
               </w:rPr>
-              <w:t>file, 7-Zip y hashes en VM; VirusTotal por hash.</w:t>
+              <w:t>file, 7-Zip y hashes en VM; VirusTotal por hash; reporte de ejecución ANY.RUN.</w:t>
             </w:r>
           </w:p>
         </w:tc>
@@ -874,7 +874,7 @@
                 <w:b w:val="0"/>
                 <w:sz w:val="20"/>
               </w:rPr>
-              <w:t>Los SHA-256, SHA-1 y MD5 y el tamaño coinciden con VT. 47 motores maliciosos. Primera observación en VT: 14/10/2026. Nombres históricos: Setup64.exe y libPdfCore.dll; el tipo real es DLL.</w:t>
+              <w:t>Los SHA-256, SHA-1 y MD5 y el tamaño coinciden con VT. 47 motores maliciosos. Primera observación en VT: 14/10/2026. Nombres históricos: Setup64.exe y libPdfCore.dll; el tipo real es DLL. ANY.RUN analizó el mismo SHA-256 y calificó la actividad como maliciosa; su tabla de detecciones incluye ejecución mediante rundll32/cmd, búsqueda de software y cambio de autorun (T1547.001). El resumen automático atribuye comunicación a 204[.]194[.]49[.]108, sin prueba de C2 o exfiltración verificable en este PDF.</w:t>
             </w:r>
           </w:p>
         </w:tc>
@@ -929,7 +929,7 @@
                 <w:b w:val="0"/>
                 <w:sz w:val="20"/>
               </w:rPr>
-              <w:t>Troyano o acceso remoto. ValleyRAT es una atribución de terceros; no determinamos la familia mediante ejecución.</w:t>
+              <w:t>Troyano o herramienta de acceso remoto según reputación y análisis de ANY.RUN. ValleyRAT/SilverFox/Winos son etiquetas del proveedor; no se confirmó una familia por análisis independiente.</w:t>
             </w:r>
           </w:p>
         </w:tc>
@@ -984,7 +984,7 @@
                 <w:b w:val="0"/>
                 <w:sz w:val="20"/>
               </w:rPr>
-              <w:t>C: posible acceso a información. I: posibles cambios no autorizados. A: efecto concreto sin determinar. Impactos potenciales, no observados.</w:t>
+              <w:t>C: posible acceso a información. I: posibles cambios no autorizados; ANY.RUN señala un cambio de autorun dentro del sandbox. A: efecto concreto sin determinar. No se demuestra impacto en un equipo externo.</w:t>
             </w:r>
           </w:p>
         </w:tc>
@@ -1094,7 +1094,7 @@
                 <w:b w:val="0"/>
                 <w:sz w:val="20"/>
               </w:rPr>
-              <w:t>Alta en identidad y reputación.</w:t>
+              <w:t>Alta en identidad y clasificación maliciosa; comportamiento específico sujeto a los límites del reporte PDF.</w:t>
             </w:r>
           </w:p>
         </w:tc>
@@ -1512,7 +1512,7 @@
                 <w:b w:val="0"/>
                 <w:sz w:val="20"/>
               </w:rPr>
-              <w:t>file, 7-Zip y hashes en VM; VirusTotal por hash.</w:t>
+              <w:t>file, 7-Zip y hashes en VM; VirusTotal por hash; reporte de ejecución ANY.RUN.</w:t>
             </w:r>
           </w:p>
         </w:tc>
@@ -1567,7 +1567,7 @@
                 <w:b w:val="0"/>
                 <w:sz w:val="20"/>
               </w:rPr>
-              <w:t>Los SHA-256, SHA-1 y MD5 y el tamaño coinciden con VT. 47 motores maliciosos. Primera observación en VT: 12/10/2026. Nombres históricos: Setup64.exe y WinCombo.exe.</w:t>
+              <w:t>Los SHA-256, SHA-1 y MD5 y el tamaño coinciden con VT. 47 motores maliciosos. Primera observación en VT: 12/10/2026. Nombres históricos: Setup64.exe y WinCombo.exe. ANY.RUN analizó el mismo SHA-256 y calificó la actividad como maliciosa; su tabla de detecciones incluye ejecución de cmd.exe y búsqueda de software. El resumen automático atribuye una configuración hacia 202[.]61[.]157[.]33, pero el PDF no confirma una conexión C2 ni exfiltración; tampoco registra persistencia.</w:t>
             </w:r>
           </w:p>
         </w:tc>
@@ -1622,7 +1622,7 @@
                 <w:b w:val="0"/>
                 <w:sz w:val="20"/>
               </w:rPr>
-              <w:t>Troyano o acceso remoto. Las etiquetas ValleyRAT, backdoor y stealer provienen de motores y reportes de terceros.</w:t>
+              <w:t>Troyano o herramienta de acceso remoto según reputación y análisis de ANY.RUN. ValleyRAT/SilverFox/Winos, backdoor y stealer son etiquetas de terceros; no se confirmó una familia por análisis independiente.</w:t>
             </w:r>
           </w:p>
         </w:tc>
@@ -1677,7 +1677,7 @@
                 <w:b w:val="0"/>
                 <w:sz w:val="20"/>
               </w:rPr>
-              <w:t>C: posible acceso a datos. I: posibles alteraciones del equipo. A: sin efecto determinado. No se observó infección ni persistencia propia.</w:t>
+              <w:t>C: posible acceso a datos. I: posibles alteraciones del equipo. A: sin efecto determinado. No se observó infección de un equipo externo ni persistencia confirmada en este reporte.</w:t>
             </w:r>
           </w:p>
         </w:tc>
@@ -1787,7 +1787,7 @@
                 <w:b w:val="0"/>
                 <w:sz w:val="20"/>
               </w:rPr>
-              <w:t>Alta en identidad y reputación.</w:t>
+              <w:t>Alta en identidad y clasificación maliciosa; comportamiento específico sujeto a los límites del reporte PDF.</w:t>
             </w:r>
           </w:p>
         </w:tc>
@@ -5436,12 +5436,526 @@
         <w:pStyle w:val="Heading1"/>
       </w:pPr>
       <w:r>
+        <w:t>Análisis dinámico de F001 y F002</w:t>
+      </w:r>
+    </w:p>
+    <w:p>
+      <w:pPr/>
+      <w:r>
+        <w:rPr>
+          <w:b/>
+        </w:rPr>
+        <w:t xml:space="preserve">Entorno. </w:t>
+      </w:r>
+      <w:r>
+        <w:t>ANY.RUN, plan gratuito, Windows 10 Professional 64 bits con red, 29/10/2026, unos 60 segundos por ejecución. Las tareas son públicas. MD5, SHA-1 y SHA-256 de cada ejecución coinciden con los calculados en la fase estática, por lo que se trata de los mismos archivos. Los resultados se ordenan por las cuatro preguntas del análisis dinámico.</w:t>
+      </w:r>
+    </w:p>
+    <w:tbl>
+      <w:tblPr>
+        <w:tblW w:type="auto" w:w="0"/>
+        <w:jc w:val="center"/>
+        <w:tblLayout w:type="fixed"/>
+        <w:tblLook w:firstColumn="1" w:firstRow="1" w:lastColumn="0" w:lastRow="0" w:noHBand="0" w:noVBand="1" w:val="04A0"/>
+        <w:tblBorders>
+          <w:top w:val="single" w:sz="4" w:color="D9D9D9"/>
+          <w:left w:val="single" w:sz="4" w:color="D9D9D9"/>
+          <w:bottom w:val="single" w:sz="4" w:color="D9D9D9"/>
+          <w:right w:val="single" w:sz="4" w:color="D9D9D9"/>
+          <w:insideH w:val="single" w:sz="4" w:color="D9D9D9"/>
+          <w:insideV w:val="single" w:sz="4" w:color="D9D9D9"/>
+        </w:tblBorders>
+      </w:tblPr>
+      <w:tblGrid>
+        <w:gridCol w:w="1596"/>
+        <w:gridCol w:w="4191"/>
+        <w:gridCol w:w="4191"/>
+      </w:tblGrid>
+      <w:tr>
+        <w:trPr>
+          <w:cantSplit/>
+          <w:tblHeader/>
+        </w:trPr>
+        <w:tc>
+          <w:tcPr>
+            <w:tcW w:type="dxa" w:w="1596"/>
+            <w:vAlign w:val="center"/>
+            <w:shd w:fill="DCE6F1"/>
+            <w:tcMar>
+              <w:top w:w="65" w:type="dxa"/>
+              <w:bottom w:w="65" w:type="dxa"/>
+              <w:left w:w="95" w:type="dxa"/>
+              <w:right w:w="95" w:type="dxa"/>
+            </w:tcMar>
+          </w:tcPr>
+          <w:p>
+            <w:pPr>
+              <w:spacing w:after="20" w:line="240" w:lineRule="auto"/>
+            </w:pPr>
+            <w:r>
+              <w:rPr>
+                <w:b/>
+                <w:sz w:val="20"/>
+              </w:rPr>
+              <w:t>Pregunta</w:t>
+            </w:r>
+          </w:p>
+        </w:tc>
+        <w:tc>
+          <w:tcPr>
+            <w:tcW w:type="dxa" w:w="4191"/>
+            <w:vAlign w:val="center"/>
+            <w:shd w:fill="DCE6F1"/>
+            <w:tcMar>
+              <w:top w:w="65" w:type="dxa"/>
+              <w:bottom w:w="65" w:type="dxa"/>
+              <w:left w:w="95" w:type="dxa"/>
+              <w:right w:w="95" w:type="dxa"/>
+            </w:tcMar>
+          </w:tcPr>
+          <w:p>
+            <w:pPr>
+              <w:spacing w:after="20" w:line="240" w:lineRule="auto"/>
+            </w:pPr>
+            <w:r>
+              <w:rPr>
+                <w:b/>
+                <w:sz w:val="20"/>
+              </w:rPr>
+              <w:t>F001 · DLL</w:t>
+            </w:r>
+          </w:p>
+        </w:tc>
+        <w:tc>
+          <w:tcPr>
+            <w:tcW w:type="dxa" w:w="4191"/>
+            <w:vAlign w:val="center"/>
+            <w:shd w:fill="DCE6F1"/>
+            <w:tcMar>
+              <w:top w:w="65" w:type="dxa"/>
+              <w:bottom w:w="65" w:type="dxa"/>
+              <w:left w:w="95" w:type="dxa"/>
+              <w:right w:w="95" w:type="dxa"/>
+            </w:tcMar>
+          </w:tcPr>
+          <w:p>
+            <w:pPr>
+              <w:spacing w:after="20" w:line="240" w:lineRule="auto"/>
+            </w:pPr>
+            <w:r>
+              <w:rPr>
+                <w:b/>
+                <w:sz w:val="20"/>
+              </w:rPr>
+              <w:t>F002 · EXE</w:t>
+            </w:r>
+          </w:p>
+        </w:tc>
+      </w:tr>
+      <w:tr>
+        <w:trPr>
+          <w:cantSplit/>
+        </w:trPr>
+        <w:tc>
+          <w:tcPr>
+            <w:tcW w:type="dxa" w:w="1596"/>
+            <w:vAlign w:val="center"/>
+            <w:shd w:fill="FFFFFF"/>
+            <w:tcMar>
+              <w:top w:w="65" w:type="dxa"/>
+              <w:bottom w:w="65" w:type="dxa"/>
+              <w:left w:w="95" w:type="dxa"/>
+              <w:right w:w="95" w:type="dxa"/>
+            </w:tcMar>
+          </w:tcPr>
+          <w:p>
+            <w:pPr>
+              <w:spacing w:after="20" w:line="240" w:lineRule="auto"/>
+            </w:pPr>
+            <w:r>
+              <w:rPr>
+                <w:b/>
+                <w:sz w:val="20"/>
+              </w:rPr>
+              <w:t>Procesos</w:t>
+            </w:r>
+          </w:p>
+        </w:tc>
+        <w:tc>
+          <w:tcPr>
+            <w:tcW w:type="dxa" w:w="4191"/>
+            <w:vAlign w:val="center"/>
+            <w:shd w:fill="FFFFFF"/>
+            <w:tcMar>
+              <w:top w:w="65" w:type="dxa"/>
+              <w:bottom w:w="65" w:type="dxa"/>
+              <w:left w:w="95" w:type="dxa"/>
+              <w:right w:w="95" w:type="dxa"/>
+            </w:tcMar>
+          </w:tcPr>
+          <w:p>
+            <w:pPr>
+              <w:spacing w:after="20" w:line="240" w:lineRule="auto"/>
+            </w:pPr>
+            <w:r>
+              <w:rPr>
+                <w:b w:val="0"/>
+                <w:sz w:val="20"/>
+              </w:rPr>
+              <w:t>explorer.exe → rundll32.exe carga la DLL desde %TEMP% (T1218.011) → cmd.exe → Setup64.exe. WinCombo.exe se inicia desde dllhost.exe, es decir, vía COM.</w:t>
+            </w:r>
+          </w:p>
+        </w:tc>
+        <w:tc>
+          <w:tcPr>
+            <w:tcW w:type="dxa" w:w="4191"/>
+            <w:vAlign w:val="center"/>
+            <w:shd w:fill="FFFFFF"/>
+            <w:tcMar>
+              <w:top w:w="65" w:type="dxa"/>
+              <w:bottom w:w="65" w:type="dxa"/>
+              <w:left w:w="95" w:type="dxa"/>
+              <w:right w:w="95" w:type="dxa"/>
+            </w:tcMar>
+          </w:tcPr>
+          <w:p>
+            <w:pPr>
+              <w:spacing w:after="20" w:line="240" w:lineRule="auto"/>
+            </w:pPr>
+            <w:r>
+              <w:rPr>
+                <w:b w:val="0"/>
+                <w:sz w:val="20"/>
+              </w:rPr>
+              <w:t>dllhost.exe (COM) → la muestra desde %TEMP% → cmd.exe (6 veces) → gpupdate /force y WinCombo.exe. Aparece consent.exe: pedido de elevación UAC.</w:t>
+            </w:r>
+          </w:p>
+        </w:tc>
+      </w:tr>
+      <w:tr>
+        <w:trPr>
+          <w:cantSplit/>
+        </w:trPr>
+        <w:tc>
+          <w:tcPr>
+            <w:tcW w:type="dxa" w:w="1596"/>
+            <w:vAlign w:val="center"/>
+            <w:shd w:fill="F5F5F5"/>
+            <w:tcMar>
+              <w:top w:w="65" w:type="dxa"/>
+              <w:bottom w:w="65" w:type="dxa"/>
+              <w:left w:w="95" w:type="dxa"/>
+              <w:right w:w="95" w:type="dxa"/>
+            </w:tcMar>
+          </w:tcPr>
+          <w:p>
+            <w:pPr>
+              <w:spacing w:after="20" w:line="240" w:lineRule="auto"/>
+            </w:pPr>
+            <w:r>
+              <w:rPr>
+                <w:b/>
+                <w:sz w:val="20"/>
+              </w:rPr>
+              <w:t>Archivos</w:t>
+            </w:r>
+          </w:p>
+        </w:tc>
+        <w:tc>
+          <w:tcPr>
+            <w:tcW w:type="dxa" w:w="4191"/>
+            <w:vAlign w:val="center"/>
+            <w:shd w:fill="F5F5F5"/>
+            <w:tcMar>
+              <w:top w:w="65" w:type="dxa"/>
+              <w:bottom w:w="65" w:type="dxa"/>
+              <w:left w:w="95" w:type="dxa"/>
+              <w:right w:w="95" w:type="dxa"/>
+            </w:tcMar>
+          </w:tcPr>
+          <w:p>
+            <w:pPr>
+              <w:spacing w:after="20" w:line="240" w:lineRule="auto"/>
+            </w:pPr>
+            <w:r>
+              <w:rPr>
+                <w:b w:val="0"/>
+                <w:sz w:val="20"/>
+              </w:rPr>
+              <w:t>Crea %TEMP%\Setup64.exe y, en C:\ProgramData\MicroPoint\, WinCombo.exe, una copia de la DLL y erasecode.dat.</w:t>
+            </w:r>
+          </w:p>
+        </w:tc>
+        <w:tc>
+          <w:tcPr>
+            <w:tcW w:type="dxa" w:w="4191"/>
+            <w:vAlign w:val="center"/>
+            <w:shd w:fill="F5F5F5"/>
+            <w:tcMar>
+              <w:top w:w="65" w:type="dxa"/>
+              <w:bottom w:w="65" w:type="dxa"/>
+              <w:left w:w="95" w:type="dxa"/>
+              <w:right w:w="95" w:type="dxa"/>
+            </w:tcMar>
+          </w:tcPr>
+          <w:p>
+            <w:pPr>
+              <w:spacing w:after="20" w:line="240" w:lineRule="auto"/>
+            </w:pPr>
+            <w:r>
+              <w:rPr>
+                <w:b w:val="0"/>
+                <w:sz w:val="20"/>
+              </w:rPr>
+              <w:t>Crea en C:\ProgramData\MicroPoint\ WinCombo.exe y erasecode.dat.</w:t>
+            </w:r>
+          </w:p>
+        </w:tc>
+      </w:tr>
+      <w:tr>
+        <w:trPr>
+          <w:cantSplit/>
+        </w:trPr>
+        <w:tc>
+          <w:tcPr>
+            <w:tcW w:type="dxa" w:w="1596"/>
+            <w:vAlign w:val="center"/>
+            <w:shd w:fill="FFFFFF"/>
+            <w:tcMar>
+              <w:top w:w="65" w:type="dxa"/>
+              <w:bottom w:w="65" w:type="dxa"/>
+              <w:left w:w="95" w:type="dxa"/>
+              <w:right w:w="95" w:type="dxa"/>
+            </w:tcMar>
+          </w:tcPr>
+          <w:p>
+            <w:pPr>
+              <w:spacing w:after="20" w:line="240" w:lineRule="auto"/>
+            </w:pPr>
+            <w:r>
+              <w:rPr>
+                <w:b/>
+                <w:sz w:val="20"/>
+              </w:rPr>
+              <w:t>Registro</w:t>
+            </w:r>
+          </w:p>
+        </w:tc>
+        <w:tc>
+          <w:tcPr>
+            <w:tcW w:type="dxa" w:w="4191"/>
+            <w:vAlign w:val="center"/>
+            <w:shd w:fill="FFFFFF"/>
+            <w:tcMar>
+              <w:top w:w="65" w:type="dxa"/>
+              <w:bottom w:w="65" w:type="dxa"/>
+              <w:left w:w="95" w:type="dxa"/>
+              <w:right w:w="95" w:type="dxa"/>
+            </w:tcMar>
+          </w:tcPr>
+          <w:p>
+            <w:pPr>
+              <w:spacing w:after="20" w:line="240" w:lineRule="auto"/>
+            </w:pPr>
+            <w:r>
+              <w:rPr>
+                <w:b w:val="0"/>
+                <w:sz w:val="20"/>
+              </w:rPr>
+              <w:t>Cambia un valor de autorun: persistencia (T1547.001). Lee nombre del equipo, GUID, idiomas y software instalado (T1082, T1012, T1518).</w:t>
+            </w:r>
+          </w:p>
+        </w:tc>
+        <w:tc>
+          <w:tcPr>
+            <w:tcW w:type="dxa" w:w="4191"/>
+            <w:vAlign w:val="center"/>
+            <w:shd w:fill="FFFFFF"/>
+            <w:tcMar>
+              <w:top w:w="65" w:type="dxa"/>
+              <w:bottom w:w="65" w:type="dxa"/>
+              <w:left w:w="95" w:type="dxa"/>
+              <w:right w:w="95" w:type="dxa"/>
+            </w:tcMar>
+          </w:tcPr>
+          <w:p>
+            <w:pPr>
+              <w:spacing w:after="20" w:line="240" w:lineRule="auto"/>
+            </w:pPr>
+            <w:r>
+              <w:rPr>
+                <w:b w:val="0"/>
+                <w:sz w:val="20"/>
+              </w:rPr>
+              <w:t>Mismas lecturas de reconocimiento. No se observó persistencia en 60 s.</w:t>
+            </w:r>
+          </w:p>
+        </w:tc>
+      </w:tr>
+      <w:tr>
+        <w:trPr>
+          <w:cantSplit/>
+        </w:trPr>
+        <w:tc>
+          <w:tcPr>
+            <w:tcW w:type="dxa" w:w="1596"/>
+            <w:vAlign w:val="center"/>
+            <w:shd w:fill="F5F5F5"/>
+            <w:tcMar>
+              <w:top w:w="65" w:type="dxa"/>
+              <w:bottom w:w="65" w:type="dxa"/>
+              <w:left w:w="95" w:type="dxa"/>
+              <w:right w:w="95" w:type="dxa"/>
+            </w:tcMar>
+          </w:tcPr>
+          <w:p>
+            <w:pPr>
+              <w:spacing w:after="20" w:line="240" w:lineRule="auto"/>
+            </w:pPr>
+            <w:r>
+              <w:rPr>
+                <w:b/>
+                <w:sz w:val="20"/>
+              </w:rPr>
+              <w:t>Red</w:t>
+            </w:r>
+          </w:p>
+        </w:tc>
+        <w:tc>
+          <w:tcPr>
+            <w:tcW w:type="dxa" w:w="4191"/>
+            <w:vAlign w:val="center"/>
+            <w:shd w:fill="F5F5F5"/>
+            <w:tcMar>
+              <w:top w:w="65" w:type="dxa"/>
+              <w:bottom w:w="65" w:type="dxa"/>
+              <w:left w:w="95" w:type="dxa"/>
+              <w:right w:w="95" w:type="dxa"/>
+            </w:tcMar>
+          </w:tcPr>
+          <w:p>
+            <w:pPr>
+              <w:spacing w:after="20" w:line="240" w:lineRule="auto"/>
+            </w:pPr>
+            <w:r>
+              <w:rPr>
+                <w:b w:val="0"/>
+                <w:sz w:val="20"/>
+              </w:rPr>
+              <w:t>IP 204[.]194[.]49[.]108 y consulta a hackmyip[.]com/api/v1/ip, que devuelve la IP pública del equipo.</w:t>
+            </w:r>
+          </w:p>
+        </w:tc>
+        <w:tc>
+          <w:tcPr>
+            <w:tcW w:type="dxa" w:w="4191"/>
+            <w:vAlign w:val="center"/>
+            <w:shd w:fill="F5F5F5"/>
+            <w:tcMar>
+              <w:top w:w="65" w:type="dxa"/>
+              <w:bottom w:w="65" w:type="dxa"/>
+              <w:left w:w="95" w:type="dxa"/>
+              <w:right w:w="95" w:type="dxa"/>
+            </w:tcMar>
+          </w:tcPr>
+          <w:p>
+            <w:pPr>
+              <w:spacing w:after="20" w:line="240" w:lineRule="auto"/>
+            </w:pPr>
+            <w:r>
+              <w:rPr>
+                <w:b w:val="0"/>
+                <w:sz w:val="20"/>
+              </w:rPr>
+              <w:t>IP 202[.]61[.]157[.]33. Sin dominios propios.</w:t>
+            </w:r>
+          </w:p>
+        </w:tc>
+      </w:tr>
+    </w:tbl>
+    <w:p>
+      <w:pPr/>
+      <w:r/>
+    </w:p>
+    <w:p>
+      <w:pPr/>
+      <w:r>
+        <w:rPr>
+          <w:b/>
+        </w:rPr>
+        <w:t xml:space="preserve">Ruido descartado. </w:t>
+      </w:r>
+      <w:r>
+        <w:t>La cadena wininit → services → svchost es el arranque normal de Windows. WaaSMedicAgent.exe pertenece a Windows Update. El tráfico OCSP/CRL de DigiCert y Microsoft, settings-win, activation, login.live y Bing es propio del sistema. ANY.RUN clasifica todos sus indicadores de red como «Unknown», no como maliciosos. La técnica T1562.001 (desactivar Defender) es heurística: no se observó PowerShell ni cambios en Defender, por lo que esas recomendaciones no se adoptan.</w:t>
+      </w:r>
+    </w:p>
+    <w:p>
+      <w:pPr/>
+      <w:r>
+        <w:rPr>
+          <w:b/>
+        </w:rPr>
+        <w:t xml:space="preserve">Relación entre muestras. </w:t>
+      </w:r>
+      <w:r>
+        <w:t>Las dos dejan los mismos artefactos en la misma carpeta: C:\ProgramData\MicroPoint\WinCombo.exe y erasecode.dat. F001 se comporta como cargador: se ejecuta con rundll32, deja Setup64.exe y termina lanzando WinCombo.exe. Setup64.exe y WinCombo.exe son justamente los nombres históricos de F002 en VirusTotal. Es un indicio fuerte de que pertenecen a la misma cadena de infección, pero no lo confirmamos: no comparamos el hash del archivo creado con el de F002. Los nombres que imitan software legítimo corresponden a T1036.005.</w:t>
+      </w:r>
+    </w:p>
+    <w:p>
+      <w:pPr/>
+      <w:r>
+        <w:rPr>
+          <w:b/>
+        </w:rPr>
+        <w:t xml:space="preserve">Límites. </w:t>
+      </w:r>
+      <w:r>
+        <w:t>Con 60 s de ejecución se puede perder comportamiento tardío; la ausencia de persistencia en F002 puede deberse a eso. Las IP figuran en el resumen automático y en la configuración extraída, pero sin el tráfico capturado no se confirma que sean C2 ni que hubiera exfiltración. El texto «AI Summary» del reporte se usó solo como guía y cada afirmación de esta sección se contrastó con las tablas de detecciones, archivos e indicadores del mismo reporte. Un análisis en Triage (5 min, Windows 10 y 11, con PCAP) permitiría confirmar la red y la persistencia.</w:t>
+      </w:r>
+    </w:p>
+    <w:p>
+      <w:pPr/>
+      <w:r>
+        <w:rPr>
+          <w:b/>
+        </w:rPr>
+        <w:t xml:space="preserve">Resultado. </w:t>
+      </w:r>
+      <w:r>
+        <w:t>El análisis dinámico confirma el veredicto estático: F001 y F002 son MALICIOSOS, con confianza alta. Muestran comportamiento de cargador y RAT: ejecución encubierta mediante binarios del sistema, archivos en ProgramData, reconocimiento del equipo, persistencia en F001 y destinos de red externos. Ningún comportamiento se observó fuera del sandbox.</w:t>
+      </w:r>
+    </w:p>
+    <w:p>
+      <w:pPr/>
+      <w:r>
+        <w:rPr>
+          <w:b/>
+        </w:rPr>
+        <w:t xml:space="preserve">Medidas. </w:t>
+      </w:r>
+      <w:r>
+        <w:t>Bloquear los hashes de F001 y F002. Buscar en los equipos la carpeta C:\ProgramData\MicroPoint\, WinCombo.exe y valores de autorun que apunten a ella. Alertar cuando rundll32 cargue DLL desde %TEMP%. Revisar en la telemetría propia las conexiones a las dos IP antes de bloquearlas.</w:t>
+      </w:r>
+    </w:p>
+    <w:p>
+      <w:pPr>
+        <w:pStyle w:val="Caption"/>
+      </w:pPr>
+      <w:r>
+        <w:t>Fuentes: PDF ANY.RUN F001 · Tarea F001 · PDF ANY.RUN F002 · Tarea F002 · Hashes estáticos.</w:t>
+      </w:r>
+    </w:p>
+    <w:p>
+      <w:pPr>
+        <w:pStyle w:val="Heading1"/>
+      </w:pPr>
+      <w:r>
         <w:t>Conclusiones</w:t>
       </w:r>
     </w:p>
     <w:p>
       <w:r>
-        <w:t>F001, F002, R004 y U002 se clasifican como maliciosos. R005, U001 y U003 permanecen sospechosos por evidencia insuficiente o señales mixtas. Los dos archivos Windows no son adjuntos de los correos; el ELF histórico de U002 es otro recurso. No se acreditó un control legítimo y no se forzó ese resultado.</w:t>
+        <w:t>F001, F002, R004 y U002 se clasifican como maliciosos. R005, U001 y U003 permanecen sospechosos por evidencia insuficiente o señales mixtas. El análisis dinámico en ANY.RUN confirmó para F001 y F002 comportamiento de cargador y RAT, e indica que forman parte de la misma cadena. Los dos archivos Windows no son adjuntos de los correos; el ELF histórico de U002 es otro recurso. No se acreditó un control legítimo ni infección fuera del sandbox.</w:t>
       </w:r>
     </w:p>
     <w:p>

</xml_diff>